<commit_message>
Add the calculus (limits & derivatives) section to the Word manuscript and Dashboard
- Dashboard: new "Cálculo" tab (18 tabs total) with the limit-definition
  table (difference quotient → f'(2)=0,89 as h→0), the per-day f'(t)
  velocity chart, and the f/f'/f" table; fed by a new `lim` block in
  dashboard_data.json.
- Manuscript (Word): new §3.11 "Formalização em cálculo: limites e
  derivadas do acúmulo de fadiga" (saturating fit, derivative-by-limit,
  f/f'/f" Tabela 10, fitness–fatigue critical point), with the visual
  synthesis renumbered to §3.12.
Numbers pulled from limites_derivadas/resultados_limites_derivadas.json.

Co-Authored-By: Claude Opus 4.8 <noreply@anthropic.com>
Claude-Session: https://claude.ai/code/session_0157sZ1CmW4MRSmx6a9GoYrN
</commit_message>
<xml_diff>
--- a/auditoria_brums_hiit/tese/Manuscrito_Completo_BRUMS_HIIT.docx
+++ b/auditoria_brums_hiit/tese/Manuscrito_Completo_BRUMS_HIIT.docx
@@ -10615,7 +10615,967 @@
         <w:spacing w:after="120" w:before="260"/>
       </w:pPr>
       <w:r>
-        <w:t xml:space="preserve">3.11. Síntese visual</w:t>
+        <w:t xml:space="preserve">3.11. Formalização em cálculo: limites e derivadas do acúmulo de fadiga</w:t>
+      </w:r>
+    </w:p>
+    <w:p>
+      <w:pPr>
+        <w:spacing w:after="140" w:before="0" w:line="276"/>
+        <w:jc w:val="both"/>
+      </w:pPr>
+      <w:r>
+        <w:t xml:space="preserve">A trajetória de acúmulo descrita em 3.3 admite uma formalização em cálculo que torna explícitas as suas propriedades. Ajustando à fadiga física média diária um modelo saturante f(t) = L − (L − f₁)·e^(−k(t−1)) (L = </w:t>
+      </w:r>
+      <w:r>
+        <w:rPr>
+          <w:b/>
+          <w:bCs/>
+        </w:rPr>
+        <w:t xml:space="preserve">6,78</w:t>
+      </w:r>
+      <w:r>
+        <w:t xml:space="preserve">; k = </w:t>
+      </w:r>
+      <w:r>
+        <w:rPr>
+          <w:b/>
+          <w:bCs/>
+        </w:rPr>
+        <w:t xml:space="preserve">0,76</w:t>
+      </w:r>
+      <w:r>
+        <w:t xml:space="preserve">; R² = </w:t>
+      </w:r>
+      <w:r>
+        <w:rPr>
+          <w:b/>
+          <w:bCs/>
+        </w:rPr>
+        <w:t xml:space="preserve">0,76</w:t>
+      </w:r>
+      <w:r>
+        <w:t xml:space="preserve">), a derivada f′(t) é a velocidade de acúmulo por dia. Em t₀ = 2, a razão incremental [f(t₀+h) − f(t₀)]/h converge para f′(t₀) = 0,89 à medida que h → 0 (0,621 → 0,738 → 0,808 → 0,855 → 0,871 → 0,884 → 0,887 para h = 1,00, 0,50, 0,25, 0,10, 0,05, 0,01, 0,001) — a definição de derivada por limite, verificada numericamente.</w:t>
+      </w:r>
+    </w:p>
+    <w:p>
+      <w:pPr>
+        <w:spacing w:after="140" w:before="0" w:line="276"/>
+        <w:jc w:val="both"/>
+      </w:pPr>
+      <w:r>
+        <w:t xml:space="preserve">A derivada é positiva e decrescente, com segunda derivada negativa (f″ &lt; 0): a fadiga acumula, mas cada vez mais devagar, saturando no </w:t>
+      </w:r>
+      <w:r>
+        <w:rPr>
+          <w:b/>
+          <w:bCs/>
+        </w:rPr>
+        <w:t xml:space="preserve">limite</w:t>
+      </w:r>
+      <w:r>
+        <w:t xml:space="preserve"> lim(t→∞) f(t) = L ≈ 6,78 — um estado estacionário do acúmulo. No modelo teórico fitness–fadiga, State(t) = k₁·e^(−t/τ₁) − k₂·e^(−t/τ₂), a derivada State′(t) = 0 define o ponto crítico t* = 2,69 — o nadir do estado (pico de fadiga aguda): antes dele o atleta ainda se recupera, depois relaxa de volta à linha de base (lim(t→∞) State(t) = 0). É a leitura em cálculo das três âncoras: acúmulo real, saturação e retorno individual.</w:t>
+      </w:r>
+    </w:p>
+    <w:tbl>
+      <w:tblPr>
+        <w:tblW w:type="dxa" w:w="9360"/>
+        <w:tblBorders>
+          <w:top w:val="single" w:color="C9D4E0" w:sz="2"/>
+          <w:left w:val="single" w:color="C9D4E0" w:sz="2"/>
+          <w:bottom w:val="single" w:color="C9D4E0" w:sz="2"/>
+          <w:right w:val="single" w:color="C9D4E0" w:sz="2"/>
+          <w:insideH w:val="single" w:color="C9D4E0" w:sz="2"/>
+          <w:insideV w:val="single" w:color="C9D4E0" w:sz="2"/>
+        </w:tblBorders>
+      </w:tblPr>
+      <w:tblGrid>
+        <w:gridCol w:w="2340"/>
+        <w:gridCol w:w="2340"/>
+        <w:gridCol w:w="2340"/>
+        <w:gridCol w:w="2340"/>
+      </w:tblGrid>
+      <w:tr>
+        <w:trPr>
+          <w:tblHeader/>
+        </w:trPr>
+        <w:tc>
+          <w:tcPr>
+            <w:tcW w:type="dxa" w:w="2340"/>
+            <w:shd w:fill="EAF1F7" w:color="auto" w:val="clear"/>
+            <w:tcMar>
+              <w:top w:type="dxa" w:w="40"/>
+              <w:left w:type="dxa" w:w="90"/>
+              <w:bottom w:type="dxa" w:w="40"/>
+              <w:right w:type="dxa" w:w="90"/>
+            </w:tcMar>
+          </w:tcPr>
+          <w:p>
+            <w:pPr>
+              <w:spacing w:after="0" w:line="240"/>
+              <w:jc w:val="left"/>
+            </w:pPr>
+            <w:r>
+              <w:rPr>
+                <w:b/>
+                <w:bCs/>
+                <w:color w:val="16273D"/>
+                <w:sz w:val="17"/>
+                <w:szCs w:val="17"/>
+              </w:rPr>
+              <w:t xml:space="preserve">Dia (t)</w:t>
+            </w:r>
+          </w:p>
+        </w:tc>
+        <w:tc>
+          <w:tcPr>
+            <w:tcW w:type="dxa" w:w="2340"/>
+            <w:shd w:fill="EAF1F7" w:color="auto" w:val="clear"/>
+            <w:tcMar>
+              <w:top w:type="dxa" w:w="40"/>
+              <w:left w:type="dxa" w:w="90"/>
+              <w:bottom w:type="dxa" w:w="40"/>
+              <w:right w:type="dxa" w:w="90"/>
+            </w:tcMar>
+          </w:tcPr>
+          <w:p>
+            <w:pPr>
+              <w:spacing w:after="0" w:line="240"/>
+              <w:jc w:val="right"/>
+            </w:pPr>
+            <w:r>
+              <w:rPr>
+                <w:b/>
+                <w:bCs/>
+                <w:color w:val="16273D"/>
+                <w:sz w:val="17"/>
+                <w:szCs w:val="17"/>
+              </w:rPr>
+              <w:t xml:space="preserve">f(t)</w:t>
+            </w:r>
+          </w:p>
+        </w:tc>
+        <w:tc>
+          <w:tcPr>
+            <w:tcW w:type="dxa" w:w="2340"/>
+            <w:shd w:fill="EAF1F7" w:color="auto" w:val="clear"/>
+            <w:tcMar>
+              <w:top w:type="dxa" w:w="40"/>
+              <w:left w:type="dxa" w:w="90"/>
+              <w:bottom w:type="dxa" w:w="40"/>
+              <w:right w:type="dxa" w:w="90"/>
+            </w:tcMar>
+          </w:tcPr>
+          <w:p>
+            <w:pPr>
+              <w:spacing w:after="0" w:line="240"/>
+              <w:jc w:val="right"/>
+            </w:pPr>
+            <w:r>
+              <w:rPr>
+                <w:b/>
+                <w:bCs/>
+                <w:color w:val="16273D"/>
+                <w:sz w:val="17"/>
+                <w:szCs w:val="17"/>
+              </w:rPr>
+              <w:t xml:space="preserve">f′(t)</w:t>
+            </w:r>
+          </w:p>
+        </w:tc>
+        <w:tc>
+          <w:tcPr>
+            <w:tcW w:type="dxa" w:w="2340"/>
+            <w:shd w:fill="EAF1F7" w:color="auto" w:val="clear"/>
+            <w:tcMar>
+              <w:top w:type="dxa" w:w="40"/>
+              <w:left w:type="dxa" w:w="90"/>
+              <w:bottom w:type="dxa" w:w="40"/>
+              <w:right w:type="dxa" w:w="90"/>
+            </w:tcMar>
+          </w:tcPr>
+          <w:p>
+            <w:pPr>
+              <w:spacing w:after="0" w:line="240"/>
+              <w:jc w:val="right"/>
+            </w:pPr>
+            <w:r>
+              <w:rPr>
+                <w:b/>
+                <w:bCs/>
+                <w:color w:val="16273D"/>
+                <w:sz w:val="17"/>
+                <w:szCs w:val="17"/>
+              </w:rPr>
+              <w:t xml:space="preserve">f″(t)</w:t>
+            </w:r>
+          </w:p>
+        </w:tc>
+      </w:tr>
+      <w:tr>
+        <w:tc>
+          <w:tcPr>
+            <w:tcW w:type="dxa" w:w="2340"/>
+            <w:tcMar>
+              <w:top w:type="dxa" w:w="40"/>
+              <w:left w:type="dxa" w:w="90"/>
+              <w:bottom w:type="dxa" w:w="40"/>
+              <w:right w:type="dxa" w:w="90"/>
+            </w:tcMar>
+          </w:tcPr>
+          <w:p>
+            <w:pPr>
+              <w:spacing w:after="0" w:line="240"/>
+              <w:jc w:val="left"/>
+            </w:pPr>
+            <w:r>
+              <w:rPr>
+                <w:b w:val="false"/>
+                <w:bCs w:val="false"/>
+                <w:sz w:val="17"/>
+                <w:szCs w:val="17"/>
+              </w:rPr>
+              <w:t xml:space="preserve">1</w:t>
+            </w:r>
+          </w:p>
+        </w:tc>
+        <w:tc>
+          <w:tcPr>
+            <w:tcW w:type="dxa" w:w="2340"/>
+            <w:tcMar>
+              <w:top w:type="dxa" w:w="40"/>
+              <w:left w:type="dxa" w:w="90"/>
+              <w:bottom w:type="dxa" w:w="40"/>
+              <w:right w:type="dxa" w:w="90"/>
+            </w:tcMar>
+          </w:tcPr>
+          <w:p>
+            <w:pPr>
+              <w:spacing w:after="0" w:line="240"/>
+              <w:jc w:val="right"/>
+            </w:pPr>
+            <w:r>
+              <w:rPr>
+                <w:b w:val="false"/>
+                <w:bCs w:val="false"/>
+                <w:sz w:val="17"/>
+                <w:szCs w:val="17"/>
+              </w:rPr>
+              <w:t xml:space="preserve">4,29</w:t>
+            </w:r>
+          </w:p>
+        </w:tc>
+        <w:tc>
+          <w:tcPr>
+            <w:tcW w:type="dxa" w:w="2340"/>
+            <w:tcMar>
+              <w:top w:type="dxa" w:w="40"/>
+              <w:left w:type="dxa" w:w="90"/>
+              <w:bottom w:type="dxa" w:w="40"/>
+              <w:right w:type="dxa" w:w="90"/>
+            </w:tcMar>
+          </w:tcPr>
+          <w:p>
+            <w:pPr>
+              <w:spacing w:after="0" w:line="240"/>
+              <w:jc w:val="right"/>
+            </w:pPr>
+            <w:r>
+              <w:rPr>
+                <w:b w:val="false"/>
+                <w:bCs w:val="false"/>
+                <w:sz w:val="17"/>
+                <w:szCs w:val="17"/>
+              </w:rPr>
+              <w:t xml:space="preserve">+1,90</w:t>
+            </w:r>
+          </w:p>
+        </w:tc>
+        <w:tc>
+          <w:tcPr>
+            <w:tcW w:type="dxa" w:w="2340"/>
+            <w:tcMar>
+              <w:top w:type="dxa" w:w="40"/>
+              <w:left w:type="dxa" w:w="90"/>
+              <w:bottom w:type="dxa" w:w="40"/>
+              <w:right w:type="dxa" w:w="90"/>
+            </w:tcMar>
+          </w:tcPr>
+          <w:p>
+            <w:pPr>
+              <w:spacing w:after="0" w:line="240"/>
+              <w:jc w:val="right"/>
+            </w:pPr>
+            <w:r>
+              <w:rPr>
+                <w:b w:val="false"/>
+                <w:bCs w:val="false"/>
+                <w:sz w:val="17"/>
+                <w:szCs w:val="17"/>
+              </w:rPr>
+              <w:t xml:space="preserve">-1,44</w:t>
+            </w:r>
+          </w:p>
+        </w:tc>
+      </w:tr>
+      <w:tr>
+        <w:tc>
+          <w:tcPr>
+            <w:tcW w:type="dxa" w:w="2340"/>
+            <w:tcMar>
+              <w:top w:type="dxa" w:w="40"/>
+              <w:left w:type="dxa" w:w="90"/>
+              <w:bottom w:type="dxa" w:w="40"/>
+              <w:right w:type="dxa" w:w="90"/>
+            </w:tcMar>
+          </w:tcPr>
+          <w:p>
+            <w:pPr>
+              <w:spacing w:after="0" w:line="240"/>
+              <w:jc w:val="left"/>
+            </w:pPr>
+            <w:r>
+              <w:rPr>
+                <w:b w:val="false"/>
+                <w:bCs w:val="false"/>
+                <w:sz w:val="17"/>
+                <w:szCs w:val="17"/>
+              </w:rPr>
+              <w:t xml:space="preserve">2</w:t>
+            </w:r>
+          </w:p>
+        </w:tc>
+        <w:tc>
+          <w:tcPr>
+            <w:tcW w:type="dxa" w:w="2340"/>
+            <w:tcMar>
+              <w:top w:type="dxa" w:w="40"/>
+              <w:left w:type="dxa" w:w="90"/>
+              <w:bottom w:type="dxa" w:w="40"/>
+              <w:right w:type="dxa" w:w="90"/>
+            </w:tcMar>
+          </w:tcPr>
+          <w:p>
+            <w:pPr>
+              <w:spacing w:after="0" w:line="240"/>
+              <w:jc w:val="right"/>
+            </w:pPr>
+            <w:r>
+              <w:rPr>
+                <w:b w:val="false"/>
+                <w:bCs w:val="false"/>
+                <w:sz w:val="17"/>
+                <w:szCs w:val="17"/>
+              </w:rPr>
+              <w:t xml:space="preserve">5,62</w:t>
+            </w:r>
+          </w:p>
+        </w:tc>
+        <w:tc>
+          <w:tcPr>
+            <w:tcW w:type="dxa" w:w="2340"/>
+            <w:tcMar>
+              <w:top w:type="dxa" w:w="40"/>
+              <w:left w:type="dxa" w:w="90"/>
+              <w:bottom w:type="dxa" w:w="40"/>
+              <w:right w:type="dxa" w:w="90"/>
+            </w:tcMar>
+          </w:tcPr>
+          <w:p>
+            <w:pPr>
+              <w:spacing w:after="0" w:line="240"/>
+              <w:jc w:val="right"/>
+            </w:pPr>
+            <w:r>
+              <w:rPr>
+                <w:b w:val="false"/>
+                <w:bCs w:val="false"/>
+                <w:sz w:val="17"/>
+                <w:szCs w:val="17"/>
+              </w:rPr>
+              <w:t xml:space="preserve">+0,89</w:t>
+            </w:r>
+          </w:p>
+        </w:tc>
+        <w:tc>
+          <w:tcPr>
+            <w:tcW w:type="dxa" w:w="2340"/>
+            <w:tcMar>
+              <w:top w:type="dxa" w:w="40"/>
+              <w:left w:type="dxa" w:w="90"/>
+              <w:bottom w:type="dxa" w:w="40"/>
+              <w:right w:type="dxa" w:w="90"/>
+            </w:tcMar>
+          </w:tcPr>
+          <w:p>
+            <w:pPr>
+              <w:spacing w:after="0" w:line="240"/>
+              <w:jc w:val="right"/>
+            </w:pPr>
+            <w:r>
+              <w:rPr>
+                <w:b w:val="false"/>
+                <w:bCs w:val="false"/>
+                <w:sz w:val="17"/>
+                <w:szCs w:val="17"/>
+              </w:rPr>
+              <w:t xml:space="preserve">-0,68</w:t>
+            </w:r>
+          </w:p>
+        </w:tc>
+      </w:tr>
+      <w:tr>
+        <w:tc>
+          <w:tcPr>
+            <w:tcW w:type="dxa" w:w="2340"/>
+            <w:tcMar>
+              <w:top w:type="dxa" w:w="40"/>
+              <w:left w:type="dxa" w:w="90"/>
+              <w:bottom w:type="dxa" w:w="40"/>
+              <w:right w:type="dxa" w:w="90"/>
+            </w:tcMar>
+          </w:tcPr>
+          <w:p>
+            <w:pPr>
+              <w:spacing w:after="0" w:line="240"/>
+              <w:jc w:val="left"/>
+            </w:pPr>
+            <w:r>
+              <w:rPr>
+                <w:b w:val="false"/>
+                <w:bCs w:val="false"/>
+                <w:sz w:val="17"/>
+                <w:szCs w:val="17"/>
+              </w:rPr>
+              <w:t xml:space="preserve">3</w:t>
+            </w:r>
+          </w:p>
+        </w:tc>
+        <w:tc>
+          <w:tcPr>
+            <w:tcW w:type="dxa" w:w="2340"/>
+            <w:tcMar>
+              <w:top w:type="dxa" w:w="40"/>
+              <w:left w:type="dxa" w:w="90"/>
+              <w:bottom w:type="dxa" w:w="40"/>
+              <w:right w:type="dxa" w:w="90"/>
+            </w:tcMar>
+          </w:tcPr>
+          <w:p>
+            <w:pPr>
+              <w:spacing w:after="0" w:line="240"/>
+              <w:jc w:val="right"/>
+            </w:pPr>
+            <w:r>
+              <w:rPr>
+                <w:b w:val="false"/>
+                <w:bCs w:val="false"/>
+                <w:sz w:val="17"/>
+                <w:szCs w:val="17"/>
+              </w:rPr>
+              <w:t xml:space="preserve">6,24</w:t>
+            </w:r>
+          </w:p>
+        </w:tc>
+        <w:tc>
+          <w:tcPr>
+            <w:tcW w:type="dxa" w:w="2340"/>
+            <w:tcMar>
+              <w:top w:type="dxa" w:w="40"/>
+              <w:left w:type="dxa" w:w="90"/>
+              <w:bottom w:type="dxa" w:w="40"/>
+              <w:right w:type="dxa" w:w="90"/>
+            </w:tcMar>
+          </w:tcPr>
+          <w:p>
+            <w:pPr>
+              <w:spacing w:after="0" w:line="240"/>
+              <w:jc w:val="right"/>
+            </w:pPr>
+            <w:r>
+              <w:rPr>
+                <w:b w:val="false"/>
+                <w:bCs w:val="false"/>
+                <w:sz w:val="17"/>
+                <w:szCs w:val="17"/>
+              </w:rPr>
+              <w:t xml:space="preserve">+0,41</w:t>
+            </w:r>
+          </w:p>
+        </w:tc>
+        <w:tc>
+          <w:tcPr>
+            <w:tcW w:type="dxa" w:w="2340"/>
+            <w:tcMar>
+              <w:top w:type="dxa" w:w="40"/>
+              <w:left w:type="dxa" w:w="90"/>
+              <w:bottom w:type="dxa" w:w="40"/>
+              <w:right w:type="dxa" w:w="90"/>
+            </w:tcMar>
+          </w:tcPr>
+          <w:p>
+            <w:pPr>
+              <w:spacing w:after="0" w:line="240"/>
+              <w:jc w:val="right"/>
+            </w:pPr>
+            <w:r>
+              <w:rPr>
+                <w:b w:val="false"/>
+                <w:bCs w:val="false"/>
+                <w:sz w:val="17"/>
+                <w:szCs w:val="17"/>
+              </w:rPr>
+              <w:t xml:space="preserve">-0,32</w:t>
+            </w:r>
+          </w:p>
+        </w:tc>
+      </w:tr>
+      <w:tr>
+        <w:tc>
+          <w:tcPr>
+            <w:tcW w:type="dxa" w:w="2340"/>
+            <w:tcMar>
+              <w:top w:type="dxa" w:w="40"/>
+              <w:left w:type="dxa" w:w="90"/>
+              <w:bottom w:type="dxa" w:w="40"/>
+              <w:right w:type="dxa" w:w="90"/>
+            </w:tcMar>
+          </w:tcPr>
+          <w:p>
+            <w:pPr>
+              <w:spacing w:after="0" w:line="240"/>
+              <w:jc w:val="left"/>
+            </w:pPr>
+            <w:r>
+              <w:rPr>
+                <w:b w:val="false"/>
+                <w:bCs w:val="false"/>
+                <w:sz w:val="17"/>
+                <w:szCs w:val="17"/>
+              </w:rPr>
+              <w:t xml:space="preserve">4</w:t>
+            </w:r>
+          </w:p>
+        </w:tc>
+        <w:tc>
+          <w:tcPr>
+            <w:tcW w:type="dxa" w:w="2340"/>
+            <w:tcMar>
+              <w:top w:type="dxa" w:w="40"/>
+              <w:left w:type="dxa" w:w="90"/>
+              <w:bottom w:type="dxa" w:w="40"/>
+              <w:right w:type="dxa" w:w="90"/>
+            </w:tcMar>
+          </w:tcPr>
+          <w:p>
+            <w:pPr>
+              <w:spacing w:after="0" w:line="240"/>
+              <w:jc w:val="right"/>
+            </w:pPr>
+            <w:r>
+              <w:rPr>
+                <w:b w:val="false"/>
+                <w:bCs w:val="false"/>
+                <w:sz w:val="17"/>
+                <w:szCs w:val="17"/>
+              </w:rPr>
+              <w:t xml:space="preserve">6,53</w:t>
+            </w:r>
+          </w:p>
+        </w:tc>
+        <w:tc>
+          <w:tcPr>
+            <w:tcW w:type="dxa" w:w="2340"/>
+            <w:tcMar>
+              <w:top w:type="dxa" w:w="40"/>
+              <w:left w:type="dxa" w:w="90"/>
+              <w:bottom w:type="dxa" w:w="40"/>
+              <w:right w:type="dxa" w:w="90"/>
+            </w:tcMar>
+          </w:tcPr>
+          <w:p>
+            <w:pPr>
+              <w:spacing w:after="0" w:line="240"/>
+              <w:jc w:val="right"/>
+            </w:pPr>
+            <w:r>
+              <w:rPr>
+                <w:b w:val="false"/>
+                <w:bCs w:val="false"/>
+                <w:sz w:val="17"/>
+                <w:szCs w:val="17"/>
+              </w:rPr>
+              <w:t xml:space="preserve">+0,19</w:t>
+            </w:r>
+          </w:p>
+        </w:tc>
+        <w:tc>
+          <w:tcPr>
+            <w:tcW w:type="dxa" w:w="2340"/>
+            <w:tcMar>
+              <w:top w:type="dxa" w:w="40"/>
+              <w:left w:type="dxa" w:w="90"/>
+              <w:bottom w:type="dxa" w:w="40"/>
+              <w:right w:type="dxa" w:w="90"/>
+            </w:tcMar>
+          </w:tcPr>
+          <w:p>
+            <w:pPr>
+              <w:spacing w:after="0" w:line="240"/>
+              <w:jc w:val="right"/>
+            </w:pPr>
+            <w:r>
+              <w:rPr>
+                <w:b w:val="false"/>
+                <w:bCs w:val="false"/>
+                <w:sz w:val="17"/>
+                <w:szCs w:val="17"/>
+              </w:rPr>
+              <w:t xml:space="preserve">-0,15</w:t>
+            </w:r>
+          </w:p>
+        </w:tc>
+      </w:tr>
+      <w:tr>
+        <w:tc>
+          <w:tcPr>
+            <w:tcW w:type="dxa" w:w="2340"/>
+            <w:tcMar>
+              <w:top w:type="dxa" w:w="40"/>
+              <w:left w:type="dxa" w:w="90"/>
+              <w:bottom w:type="dxa" w:w="40"/>
+              <w:right w:type="dxa" w:w="90"/>
+            </w:tcMar>
+          </w:tcPr>
+          <w:p>
+            <w:pPr>
+              <w:spacing w:after="0" w:line="240"/>
+              <w:jc w:val="left"/>
+            </w:pPr>
+            <w:r>
+              <w:rPr>
+                <w:b w:val="false"/>
+                <w:bCs w:val="false"/>
+                <w:sz w:val="17"/>
+                <w:szCs w:val="17"/>
+              </w:rPr>
+              <w:t xml:space="preserve">5</w:t>
+            </w:r>
+          </w:p>
+        </w:tc>
+        <w:tc>
+          <w:tcPr>
+            <w:tcW w:type="dxa" w:w="2340"/>
+            <w:tcMar>
+              <w:top w:type="dxa" w:w="40"/>
+              <w:left w:type="dxa" w:w="90"/>
+              <w:bottom w:type="dxa" w:w="40"/>
+              <w:right w:type="dxa" w:w="90"/>
+            </w:tcMar>
+          </w:tcPr>
+          <w:p>
+            <w:pPr>
+              <w:spacing w:after="0" w:line="240"/>
+              <w:jc w:val="right"/>
+            </w:pPr>
+            <w:r>
+              <w:rPr>
+                <w:b w:val="false"/>
+                <w:bCs w:val="false"/>
+                <w:sz w:val="17"/>
+                <w:szCs w:val="17"/>
+              </w:rPr>
+              <w:t xml:space="preserve">6,67</w:t>
+            </w:r>
+          </w:p>
+        </w:tc>
+        <w:tc>
+          <w:tcPr>
+            <w:tcW w:type="dxa" w:w="2340"/>
+            <w:tcMar>
+              <w:top w:type="dxa" w:w="40"/>
+              <w:left w:type="dxa" w:w="90"/>
+              <w:bottom w:type="dxa" w:w="40"/>
+              <w:right w:type="dxa" w:w="90"/>
+            </w:tcMar>
+          </w:tcPr>
+          <w:p>
+            <w:pPr>
+              <w:spacing w:after="0" w:line="240"/>
+              <w:jc w:val="right"/>
+            </w:pPr>
+            <w:r>
+              <w:rPr>
+                <w:b w:val="false"/>
+                <w:bCs w:val="false"/>
+                <w:sz w:val="17"/>
+                <w:szCs w:val="17"/>
+              </w:rPr>
+              <w:t xml:space="preserve">+0,09</w:t>
+            </w:r>
+          </w:p>
+        </w:tc>
+        <w:tc>
+          <w:tcPr>
+            <w:tcW w:type="dxa" w:w="2340"/>
+            <w:tcMar>
+              <w:top w:type="dxa" w:w="40"/>
+              <w:left w:type="dxa" w:w="90"/>
+              <w:bottom w:type="dxa" w:w="40"/>
+              <w:right w:type="dxa" w:w="90"/>
+            </w:tcMar>
+          </w:tcPr>
+          <w:p>
+            <w:pPr>
+              <w:spacing w:after="0" w:line="240"/>
+              <w:jc w:val="right"/>
+            </w:pPr>
+            <w:r>
+              <w:rPr>
+                <w:b w:val="false"/>
+                <w:bCs w:val="false"/>
+                <w:sz w:val="17"/>
+                <w:szCs w:val="17"/>
+              </w:rPr>
+              <w:t xml:space="preserve">-0,07</w:t>
+            </w:r>
+          </w:p>
+        </w:tc>
+      </w:tr>
+      <w:tr>
+        <w:tc>
+          <w:tcPr>
+            <w:tcW w:type="dxa" w:w="2340"/>
+            <w:tcMar>
+              <w:top w:type="dxa" w:w="40"/>
+              <w:left w:type="dxa" w:w="90"/>
+              <w:bottom w:type="dxa" w:w="40"/>
+              <w:right w:type="dxa" w:w="90"/>
+            </w:tcMar>
+          </w:tcPr>
+          <w:p>
+            <w:pPr>
+              <w:spacing w:after="0" w:line="240"/>
+              <w:jc w:val="left"/>
+            </w:pPr>
+            <w:r>
+              <w:rPr>
+                <w:b w:val="false"/>
+                <w:bCs w:val="false"/>
+                <w:sz w:val="17"/>
+                <w:szCs w:val="17"/>
+              </w:rPr>
+              <w:t xml:space="preserve">6</w:t>
+            </w:r>
+          </w:p>
+        </w:tc>
+        <w:tc>
+          <w:tcPr>
+            <w:tcW w:type="dxa" w:w="2340"/>
+            <w:tcMar>
+              <w:top w:type="dxa" w:w="40"/>
+              <w:left w:type="dxa" w:w="90"/>
+              <w:bottom w:type="dxa" w:w="40"/>
+              <w:right w:type="dxa" w:w="90"/>
+            </w:tcMar>
+          </w:tcPr>
+          <w:p>
+            <w:pPr>
+              <w:spacing w:after="0" w:line="240"/>
+              <w:jc w:val="right"/>
+            </w:pPr>
+            <w:r>
+              <w:rPr>
+                <w:b w:val="false"/>
+                <w:bCs w:val="false"/>
+                <w:sz w:val="17"/>
+                <w:szCs w:val="17"/>
+              </w:rPr>
+              <w:t xml:space="preserve">6,73</w:t>
+            </w:r>
+          </w:p>
+        </w:tc>
+        <w:tc>
+          <w:tcPr>
+            <w:tcW w:type="dxa" w:w="2340"/>
+            <w:tcMar>
+              <w:top w:type="dxa" w:w="40"/>
+              <w:left w:type="dxa" w:w="90"/>
+              <w:bottom w:type="dxa" w:w="40"/>
+              <w:right w:type="dxa" w:w="90"/>
+            </w:tcMar>
+          </w:tcPr>
+          <w:p>
+            <w:pPr>
+              <w:spacing w:after="0" w:line="240"/>
+              <w:jc w:val="right"/>
+            </w:pPr>
+            <w:r>
+              <w:rPr>
+                <w:b w:val="false"/>
+                <w:bCs w:val="false"/>
+                <w:sz w:val="17"/>
+                <w:szCs w:val="17"/>
+              </w:rPr>
+              <w:t xml:space="preserve">+0,04</w:t>
+            </w:r>
+          </w:p>
+        </w:tc>
+        <w:tc>
+          <w:tcPr>
+            <w:tcW w:type="dxa" w:w="2340"/>
+            <w:tcMar>
+              <w:top w:type="dxa" w:w="40"/>
+              <w:left w:type="dxa" w:w="90"/>
+              <w:bottom w:type="dxa" w:w="40"/>
+              <w:right w:type="dxa" w:w="90"/>
+            </w:tcMar>
+          </w:tcPr>
+          <w:p>
+            <w:pPr>
+              <w:spacing w:after="0" w:line="240"/>
+              <w:jc w:val="right"/>
+            </w:pPr>
+            <w:r>
+              <w:rPr>
+                <w:b w:val="false"/>
+                <w:bCs w:val="false"/>
+                <w:sz w:val="17"/>
+                <w:szCs w:val="17"/>
+              </w:rPr>
+              <w:t xml:space="preserve">-0,03</w:t>
+            </w:r>
+          </w:p>
+        </w:tc>
+      </w:tr>
+      <w:tr>
+        <w:tc>
+          <w:tcPr>
+            <w:tcW w:type="dxa" w:w="2340"/>
+            <w:tcMar>
+              <w:top w:type="dxa" w:w="40"/>
+              <w:left w:type="dxa" w:w="90"/>
+              <w:bottom w:type="dxa" w:w="40"/>
+              <w:right w:type="dxa" w:w="90"/>
+            </w:tcMar>
+          </w:tcPr>
+          <w:p>
+            <w:pPr>
+              <w:spacing w:after="0" w:line="240"/>
+              <w:jc w:val="left"/>
+            </w:pPr>
+            <w:r>
+              <w:rPr>
+                <w:b w:val="false"/>
+                <w:bCs w:val="false"/>
+                <w:sz w:val="17"/>
+                <w:szCs w:val="17"/>
+              </w:rPr>
+              <w:t xml:space="preserve">7</w:t>
+            </w:r>
+          </w:p>
+        </w:tc>
+        <w:tc>
+          <w:tcPr>
+            <w:tcW w:type="dxa" w:w="2340"/>
+            <w:tcMar>
+              <w:top w:type="dxa" w:w="40"/>
+              <w:left w:type="dxa" w:w="90"/>
+              <w:bottom w:type="dxa" w:w="40"/>
+              <w:right w:type="dxa" w:w="90"/>
+            </w:tcMar>
+          </w:tcPr>
+          <w:p>
+            <w:pPr>
+              <w:spacing w:after="0" w:line="240"/>
+              <w:jc w:val="right"/>
+            </w:pPr>
+            <w:r>
+              <w:rPr>
+                <w:b w:val="false"/>
+                <w:bCs w:val="false"/>
+                <w:sz w:val="17"/>
+                <w:szCs w:val="17"/>
+              </w:rPr>
+              <w:t xml:space="preserve">6,76</w:t>
+            </w:r>
+          </w:p>
+        </w:tc>
+        <w:tc>
+          <w:tcPr>
+            <w:tcW w:type="dxa" w:w="2340"/>
+            <w:tcMar>
+              <w:top w:type="dxa" w:w="40"/>
+              <w:left w:type="dxa" w:w="90"/>
+              <w:bottom w:type="dxa" w:w="40"/>
+              <w:right w:type="dxa" w:w="90"/>
+            </w:tcMar>
+          </w:tcPr>
+          <w:p>
+            <w:pPr>
+              <w:spacing w:after="0" w:line="240"/>
+              <w:jc w:val="right"/>
+            </w:pPr>
+            <w:r>
+              <w:rPr>
+                <w:b w:val="false"/>
+                <w:bCs w:val="false"/>
+                <w:sz w:val="17"/>
+                <w:szCs w:val="17"/>
+              </w:rPr>
+              <w:t xml:space="preserve">+0,02</w:t>
+            </w:r>
+          </w:p>
+        </w:tc>
+        <w:tc>
+          <w:tcPr>
+            <w:tcW w:type="dxa" w:w="2340"/>
+            <w:tcMar>
+              <w:top w:type="dxa" w:w="40"/>
+              <w:left w:type="dxa" w:w="90"/>
+              <w:bottom w:type="dxa" w:w="40"/>
+              <w:right w:type="dxa" w:w="90"/>
+            </w:tcMar>
+          </w:tcPr>
+          <w:p>
+            <w:pPr>
+              <w:spacing w:after="0" w:line="240"/>
+              <w:jc w:val="right"/>
+            </w:pPr>
+            <w:r>
+              <w:rPr>
+                <w:b w:val="false"/>
+                <w:bCs w:val="false"/>
+                <w:sz w:val="17"/>
+                <w:szCs w:val="17"/>
+              </w:rPr>
+              <w:t xml:space="preserve">-0,01</w:t>
+            </w:r>
+          </w:p>
+        </w:tc>
+      </w:tr>
+    </w:tbl>
+    <w:p>
+      <w:pPr>
+        <w:spacing w:after="180" w:before="60"/>
+      </w:pPr>
+      <w:r>
+        <w:rPr>
+          <w:i/>
+          <w:iCs/>
+          <w:color w:val="5B6B82"/>
+          <w:sz w:val="17"/>
+          <w:szCs w:val="17"/>
+        </w:rPr>
+        <w:t xml:space="preserve">Tabela 10. Função ajustada f(t), velocidade de acúmulo f′(t) e aceleração f″(t) por dia (fadiga física média diária). f′ positiva e decrescente; f″ negativa — acúmulo saturante.</w:t>
+      </w:r>
+    </w:p>
+    <w:p>
+      <w:pPr>
+        <w:pStyle w:val="Heading2"/>
+        <w:spacing w:after="120" w:before="260"/>
+      </w:pPr>
+      <w:r>
+        <w:t xml:space="preserve">3.12. Síntese visual</w:t>
       </w:r>
     </w:p>
     <w:p>

</xml_diff>

<commit_message>
Manuscrito Word: seções carga×humor, preditores de fadiga e discussão integrada
- §3.13 Carga interna × perfil de humor e preditores de estado de fadiga:
  desacoplamento carga↔humor (FDR) + Tabela 11 (AUC/sens/spec/ICC) + Figura 2.
- §3.14 Discussão integrada: interpretação estatística, fisiológica e
  psicológica; pontos fortes, validade e impactos — ligada aos objetivos.
- Conclusões: limitações ampliadas + direções futuras.
- Referências verificadas (Saw 2016; Haddad 2017; Marques 2020; Patten 2022).

Co-Authored-By: Claude Opus 4.8 <noreply@anthropic.com>
Claude-Session: https://claude.ai/code/session_0157sZ1CmW4MRSmx6a9GoYrN
</commit_message>
<xml_diff>
--- a/auditoria_brums_hiit/tese/Manuscrito_Completo_BRUMS_HIIT.docx
+++ b/auditoria_brums_hiit/tese/Manuscrito_Completo_BRUMS_HIIT.docx
@@ -11646,6 +11646,1487 @@
     </w:p>
     <w:p>
       <w:pPr>
+        <w:pStyle w:val="Heading2"/>
+        <w:spacing w:after="120" w:before="260"/>
+      </w:pPr>
+      <w:r>
+        <w:t xml:space="preserve">3.13. Carga interna × perfil de humor e preditores de estado de fadiga</w:t>
+      </w:r>
+    </w:p>
+    <w:p>
+      <w:pPr>
+        <w:spacing w:after="140" w:before="0" w:line="276"/>
+        <w:jc w:val="both"/>
+      </w:pPr>
+      <w:r>
+        <w:t xml:space="preserve">Duas perguntas aplicadas fecham o arco carga→humor, mantendo o atleta como unidade (correlações no nível do atleta, n = 25, com correção FDR) e validação por bootstrap agrupado por atleta. Primeira: a carga interna (PSE, FC de pico, TRIMP) liga-se a cada dimensão do humor? Estendendo o acoplamento a todo o perfil — as seis subescalas e os índices derivados —, o padrão é de desacoplamento: nenhum par carga × humor sobrevive à correção FDR, seja na leitura tônica (média do atleta nos dias de HIIT) ou aguda (Δ pós−pré). Restam apenas dois sinais fracos no p bruto (não após FDR): no agudo, PSE × Tensão (r = +0,41) e PSE × Confusão (r = +0,40) — a percepção de esforço acompanha ativação/confusão momentânea, não fadiga. A carga interna prescreve o estímulo; a resposta de humor carrega informação que a carga objetiva não captura, o que fundamenta a superioridade das medidas subjetivas no monitoramento da resposta ao treino (Saw, Main &amp; Gastin, 2016; Haddad et al., 2017).</w:t>
+      </w:r>
+    </w:p>
+    <w:p>
+      <w:pPr>
+        <w:spacing w:after="140" w:before="0" w:line="276"/>
+        <w:jc w:val="both"/>
+      </w:pPr>
+      <w:r>
+        <w:t xml:space="preserve">Segunda pergunta: entre as variáveis de humor, quais são simultaneamente sensíveis e confiáveis para sinalizar um estado de fadiga alta vs. baixa? Definindo o alvo como o tercil superior vs. inferior da subescala Fadiga (n = 170/163; PTH excluído por conter aritmeticamente a Fadiga), cada preditor concorrente foi avaliado por AUC (Mann–Whitney; IC95% por bootstrap agrupado por atleta), sensibilidade e especificidade no ponto de Youden, e confiabilidade por ICC(2,1) entre medidas repetidas. A fadiga física é o marcador mais sensível (AUC 0,90); seu ICC baixo (0,28) é a assinatura esperada de um bom marcador de estado, que deve oscilar com a carga. A fadiga mental e a depressão combinam sensibilidade com estabilidade (ICC 0,72 e 0,79), sendo os marcadores confiáveis dia a dia; o vigor é sensível pelo eixo energético; e a tensão, apesar de a mais estável, é praticamente cega à fadiga. Por um caminho independente — classificação/ROC — reencontra-se o eixo energia–fadiga dos modelos mistos, da análise fatorial e da invariância.</w:t>
+      </w:r>
+    </w:p>
+    <w:tbl>
+      <w:tblPr>
+        <w:tblW w:type="dxa" w:w="9360"/>
+        <w:tblBorders>
+          <w:top w:val="single" w:color="C9D4E0" w:sz="2"/>
+          <w:left w:val="single" w:color="C9D4E0" w:sz="2"/>
+          <w:bottom w:val="single" w:color="C9D4E0" w:sz="2"/>
+          <w:right w:val="single" w:color="C9D4E0" w:sz="2"/>
+          <w:insideH w:val="single" w:color="C9D4E0" w:sz="2"/>
+          <w:insideV w:val="single" w:color="C9D4E0" w:sz="2"/>
+        </w:tblBorders>
+      </w:tblPr>
+      <w:tblGrid>
+        <w:gridCol w:w="3160"/>
+        <w:gridCol w:w="1240"/>
+        <w:gridCol w:w="1960"/>
+        <w:gridCol w:w="1000"/>
+        <w:gridCol w:w="1000"/>
+        <w:gridCol w:w="1000"/>
+      </w:tblGrid>
+      <w:tr>
+        <w:trPr>
+          <w:tblHeader/>
+        </w:trPr>
+        <w:tc>
+          <w:tcPr>
+            <w:tcW w:type="dxa" w:w="3160"/>
+            <w:shd w:fill="EAF1F7" w:color="auto" w:val="clear"/>
+            <w:tcMar>
+              <w:top w:type="dxa" w:w="40"/>
+              <w:left w:type="dxa" w:w="90"/>
+              <w:bottom w:type="dxa" w:w="40"/>
+              <w:right w:type="dxa" w:w="90"/>
+            </w:tcMar>
+          </w:tcPr>
+          <w:p>
+            <w:pPr>
+              <w:spacing w:after="0" w:line="240"/>
+              <w:jc w:val="left"/>
+            </w:pPr>
+            <w:r>
+              <w:rPr>
+                <w:b/>
+                <w:bCs/>
+                <w:color w:val="16273D"/>
+                <w:sz w:val="17"/>
+                <w:szCs w:val="17"/>
+              </w:rPr>
+              <w:t xml:space="preserve">Preditor</w:t>
+            </w:r>
+          </w:p>
+        </w:tc>
+        <w:tc>
+          <w:tcPr>
+            <w:tcW w:type="dxa" w:w="1240"/>
+            <w:shd w:fill="EAF1F7" w:color="auto" w:val="clear"/>
+            <w:tcMar>
+              <w:top w:type="dxa" w:w="40"/>
+              <w:left w:type="dxa" w:w="90"/>
+              <w:bottom w:type="dxa" w:w="40"/>
+              <w:right w:type="dxa" w:w="90"/>
+            </w:tcMar>
+          </w:tcPr>
+          <w:p>
+            <w:pPr>
+              <w:spacing w:after="0" w:line="240"/>
+              <w:jc w:val="right"/>
+            </w:pPr>
+            <w:r>
+              <w:rPr>
+                <w:b/>
+                <w:bCs/>
+                <w:color w:val="16273D"/>
+                <w:sz w:val="17"/>
+                <w:szCs w:val="17"/>
+              </w:rPr>
+              <w:t xml:space="preserve">AUC</w:t>
+            </w:r>
+          </w:p>
+        </w:tc>
+        <w:tc>
+          <w:tcPr>
+            <w:tcW w:type="dxa" w:w="1960"/>
+            <w:shd w:fill="EAF1F7" w:color="auto" w:val="clear"/>
+            <w:tcMar>
+              <w:top w:type="dxa" w:w="40"/>
+              <w:left w:type="dxa" w:w="90"/>
+              <w:bottom w:type="dxa" w:w="40"/>
+              <w:right w:type="dxa" w:w="90"/>
+            </w:tcMar>
+          </w:tcPr>
+          <w:p>
+            <w:pPr>
+              <w:spacing w:after="0" w:line="240"/>
+              <w:jc w:val="right"/>
+            </w:pPr>
+            <w:r>
+              <w:rPr>
+                <w:b/>
+                <w:bCs/>
+                <w:color w:val="16273D"/>
+                <w:sz w:val="17"/>
+                <w:szCs w:val="17"/>
+              </w:rPr>
+              <w:t xml:space="preserve">IC95%</w:t>
+            </w:r>
+          </w:p>
+        </w:tc>
+        <w:tc>
+          <w:tcPr>
+            <w:tcW w:type="dxa" w:w="1000"/>
+            <w:shd w:fill="EAF1F7" w:color="auto" w:val="clear"/>
+            <w:tcMar>
+              <w:top w:type="dxa" w:w="40"/>
+              <w:left w:type="dxa" w:w="90"/>
+              <w:bottom w:type="dxa" w:w="40"/>
+              <w:right w:type="dxa" w:w="90"/>
+            </w:tcMar>
+          </w:tcPr>
+          <w:p>
+            <w:pPr>
+              <w:spacing w:after="0" w:line="240"/>
+              <w:jc w:val="right"/>
+            </w:pPr>
+            <w:r>
+              <w:rPr>
+                <w:b/>
+                <w:bCs/>
+                <w:color w:val="16273D"/>
+                <w:sz w:val="17"/>
+                <w:szCs w:val="17"/>
+              </w:rPr>
+              <w:t xml:space="preserve">Sensib.</w:t>
+            </w:r>
+          </w:p>
+        </w:tc>
+        <w:tc>
+          <w:tcPr>
+            <w:tcW w:type="dxa" w:w="1000"/>
+            <w:shd w:fill="EAF1F7" w:color="auto" w:val="clear"/>
+            <w:tcMar>
+              <w:top w:type="dxa" w:w="40"/>
+              <w:left w:type="dxa" w:w="90"/>
+              <w:bottom w:type="dxa" w:w="40"/>
+              <w:right w:type="dxa" w:w="90"/>
+            </w:tcMar>
+          </w:tcPr>
+          <w:p>
+            <w:pPr>
+              <w:spacing w:after="0" w:line="240"/>
+              <w:jc w:val="right"/>
+            </w:pPr>
+            <w:r>
+              <w:rPr>
+                <w:b/>
+                <w:bCs/>
+                <w:color w:val="16273D"/>
+                <w:sz w:val="17"/>
+                <w:szCs w:val="17"/>
+              </w:rPr>
+              <w:t xml:space="preserve">Especif.</w:t>
+            </w:r>
+          </w:p>
+        </w:tc>
+        <w:tc>
+          <w:tcPr>
+            <w:tcW w:type="dxa" w:w="1000"/>
+            <w:shd w:fill="EAF1F7" w:color="auto" w:val="clear"/>
+            <w:tcMar>
+              <w:top w:type="dxa" w:w="40"/>
+              <w:left w:type="dxa" w:w="90"/>
+              <w:bottom w:type="dxa" w:w="40"/>
+              <w:right w:type="dxa" w:w="90"/>
+            </w:tcMar>
+          </w:tcPr>
+          <w:p>
+            <w:pPr>
+              <w:spacing w:after="0" w:line="240"/>
+              <w:jc w:val="right"/>
+            </w:pPr>
+            <w:r>
+              <w:rPr>
+                <w:b/>
+                <w:bCs/>
+                <w:color w:val="16273D"/>
+                <w:sz w:val="17"/>
+                <w:szCs w:val="17"/>
+              </w:rPr>
+              <w:t xml:space="preserve">ICC(2,1)</w:t>
+            </w:r>
+          </w:p>
+        </w:tc>
+      </w:tr>
+      <w:tr>
+        <w:tc>
+          <w:tcPr>
+            <w:tcW w:type="dxa" w:w="3160"/>
+            <w:tcMar>
+              <w:top w:type="dxa" w:w="40"/>
+              <w:left w:type="dxa" w:w="90"/>
+              <w:bottom w:type="dxa" w:w="40"/>
+              <w:right w:type="dxa" w:w="90"/>
+            </w:tcMar>
+          </w:tcPr>
+          <w:p>
+            <w:pPr>
+              <w:spacing w:after="0" w:line="240"/>
+              <w:jc w:val="left"/>
+            </w:pPr>
+            <w:r>
+              <w:rPr>
+                <w:b w:val="false"/>
+                <w:bCs w:val="false"/>
+                <w:sz w:val="17"/>
+                <w:szCs w:val="17"/>
+              </w:rPr>
+              <w:t xml:space="preserve">Fadiga física</w:t>
+            </w:r>
+          </w:p>
+        </w:tc>
+        <w:tc>
+          <w:tcPr>
+            <w:tcW w:type="dxa" w:w="1240"/>
+            <w:tcMar>
+              <w:top w:type="dxa" w:w="40"/>
+              <w:left w:type="dxa" w:w="90"/>
+              <w:bottom w:type="dxa" w:w="40"/>
+              <w:right w:type="dxa" w:w="90"/>
+            </w:tcMar>
+          </w:tcPr>
+          <w:p>
+            <w:pPr>
+              <w:spacing w:after="0" w:line="240"/>
+              <w:jc w:val="right"/>
+            </w:pPr>
+            <w:r>
+              <w:rPr>
+                <w:b w:val="false"/>
+                <w:bCs w:val="false"/>
+                <w:sz w:val="17"/>
+                <w:szCs w:val="17"/>
+              </w:rPr>
+              <w:t xml:space="preserve">0,90</w:t>
+            </w:r>
+          </w:p>
+        </w:tc>
+        <w:tc>
+          <w:tcPr>
+            <w:tcW w:type="dxa" w:w="1960"/>
+            <w:tcMar>
+              <w:top w:type="dxa" w:w="40"/>
+              <w:left w:type="dxa" w:w="90"/>
+              <w:bottom w:type="dxa" w:w="40"/>
+              <w:right w:type="dxa" w:w="90"/>
+            </w:tcMar>
+          </w:tcPr>
+          <w:p>
+            <w:pPr>
+              <w:spacing w:after="0" w:line="240"/>
+              <w:jc w:val="right"/>
+            </w:pPr>
+            <w:r>
+              <w:rPr>
+                <w:b w:val="false"/>
+                <w:bCs w:val="false"/>
+                <w:sz w:val="17"/>
+                <w:szCs w:val="17"/>
+              </w:rPr>
+              <w:t xml:space="preserve">[0,84; 0,95]</w:t>
+            </w:r>
+          </w:p>
+        </w:tc>
+        <w:tc>
+          <w:tcPr>
+            <w:tcW w:type="dxa" w:w="1000"/>
+            <w:tcMar>
+              <w:top w:type="dxa" w:w="40"/>
+              <w:left w:type="dxa" w:w="90"/>
+              <w:bottom w:type="dxa" w:w="40"/>
+              <w:right w:type="dxa" w:w="90"/>
+            </w:tcMar>
+          </w:tcPr>
+          <w:p>
+            <w:pPr>
+              <w:spacing w:after="0" w:line="240"/>
+              <w:jc w:val="right"/>
+            </w:pPr>
+            <w:r>
+              <w:rPr>
+                <w:b w:val="false"/>
+                <w:bCs w:val="false"/>
+                <w:sz w:val="17"/>
+                <w:szCs w:val="17"/>
+              </w:rPr>
+              <w:t xml:space="preserve">0,85</w:t>
+            </w:r>
+          </w:p>
+        </w:tc>
+        <w:tc>
+          <w:tcPr>
+            <w:tcW w:type="dxa" w:w="1000"/>
+            <w:tcMar>
+              <w:top w:type="dxa" w:w="40"/>
+              <w:left w:type="dxa" w:w="90"/>
+              <w:bottom w:type="dxa" w:w="40"/>
+              <w:right w:type="dxa" w:w="90"/>
+            </w:tcMar>
+          </w:tcPr>
+          <w:p>
+            <w:pPr>
+              <w:spacing w:after="0" w:line="240"/>
+              <w:jc w:val="right"/>
+            </w:pPr>
+            <w:r>
+              <w:rPr>
+                <w:b w:val="false"/>
+                <w:bCs w:val="false"/>
+                <w:sz w:val="17"/>
+                <w:szCs w:val="17"/>
+              </w:rPr>
+              <w:t xml:space="preserve">0,83</w:t>
+            </w:r>
+          </w:p>
+        </w:tc>
+        <w:tc>
+          <w:tcPr>
+            <w:tcW w:type="dxa" w:w="1000"/>
+            <w:tcMar>
+              <w:top w:type="dxa" w:w="40"/>
+              <w:left w:type="dxa" w:w="90"/>
+              <w:bottom w:type="dxa" w:w="40"/>
+              <w:right w:type="dxa" w:w="90"/>
+            </w:tcMar>
+          </w:tcPr>
+          <w:p>
+            <w:pPr>
+              <w:spacing w:after="0" w:line="240"/>
+              <w:jc w:val="right"/>
+            </w:pPr>
+            <w:r>
+              <w:rPr>
+                <w:b w:val="false"/>
+                <w:bCs w:val="false"/>
+                <w:sz w:val="17"/>
+                <w:szCs w:val="17"/>
+              </w:rPr>
+              <w:t xml:space="preserve">0,28</w:t>
+            </w:r>
+          </w:p>
+        </w:tc>
+      </w:tr>
+      <w:tr>
+        <w:tc>
+          <w:tcPr>
+            <w:tcW w:type="dxa" w:w="3160"/>
+            <w:tcMar>
+              <w:top w:type="dxa" w:w="40"/>
+              <w:left w:type="dxa" w:w="90"/>
+              <w:bottom w:type="dxa" w:w="40"/>
+              <w:right w:type="dxa" w:w="90"/>
+            </w:tcMar>
+          </w:tcPr>
+          <w:p>
+            <w:pPr>
+              <w:spacing w:after="0" w:line="240"/>
+              <w:jc w:val="left"/>
+            </w:pPr>
+            <w:r>
+              <w:rPr>
+                <w:b w:val="false"/>
+                <w:bCs w:val="false"/>
+                <w:sz w:val="17"/>
+                <w:szCs w:val="17"/>
+              </w:rPr>
+              <w:t xml:space="preserve">Fadiga mental</w:t>
+            </w:r>
+          </w:p>
+        </w:tc>
+        <w:tc>
+          <w:tcPr>
+            <w:tcW w:type="dxa" w:w="1240"/>
+            <w:tcMar>
+              <w:top w:type="dxa" w:w="40"/>
+              <w:left w:type="dxa" w:w="90"/>
+              <w:bottom w:type="dxa" w:w="40"/>
+              <w:right w:type="dxa" w:w="90"/>
+            </w:tcMar>
+          </w:tcPr>
+          <w:p>
+            <w:pPr>
+              <w:spacing w:after="0" w:line="240"/>
+              <w:jc w:val="right"/>
+            </w:pPr>
+            <w:r>
+              <w:rPr>
+                <w:b w:val="false"/>
+                <w:bCs w:val="false"/>
+                <w:sz w:val="17"/>
+                <w:szCs w:val="17"/>
+              </w:rPr>
+              <w:t xml:space="preserve">0,76</w:t>
+            </w:r>
+          </w:p>
+        </w:tc>
+        <w:tc>
+          <w:tcPr>
+            <w:tcW w:type="dxa" w:w="1960"/>
+            <w:tcMar>
+              <w:top w:type="dxa" w:w="40"/>
+              <w:left w:type="dxa" w:w="90"/>
+              <w:bottom w:type="dxa" w:w="40"/>
+              <w:right w:type="dxa" w:w="90"/>
+            </w:tcMar>
+          </w:tcPr>
+          <w:p>
+            <w:pPr>
+              <w:spacing w:after="0" w:line="240"/>
+              <w:jc w:val="right"/>
+            </w:pPr>
+            <w:r>
+              <w:rPr>
+                <w:b w:val="false"/>
+                <w:bCs w:val="false"/>
+                <w:sz w:val="17"/>
+                <w:szCs w:val="17"/>
+              </w:rPr>
+              <w:t xml:space="preserve">[0,56; 0,90]</w:t>
+            </w:r>
+          </w:p>
+        </w:tc>
+        <w:tc>
+          <w:tcPr>
+            <w:tcW w:type="dxa" w:w="1000"/>
+            <w:tcMar>
+              <w:top w:type="dxa" w:w="40"/>
+              <w:left w:type="dxa" w:w="90"/>
+              <w:bottom w:type="dxa" w:w="40"/>
+              <w:right w:type="dxa" w:w="90"/>
+            </w:tcMar>
+          </w:tcPr>
+          <w:p>
+            <w:pPr>
+              <w:spacing w:after="0" w:line="240"/>
+              <w:jc w:val="right"/>
+            </w:pPr>
+            <w:r>
+              <w:rPr>
+                <w:b w:val="false"/>
+                <w:bCs w:val="false"/>
+                <w:sz w:val="17"/>
+                <w:szCs w:val="17"/>
+              </w:rPr>
+              <w:t xml:space="preserve">0,65</w:t>
+            </w:r>
+          </w:p>
+        </w:tc>
+        <w:tc>
+          <w:tcPr>
+            <w:tcW w:type="dxa" w:w="1000"/>
+            <w:tcMar>
+              <w:top w:type="dxa" w:w="40"/>
+              <w:left w:type="dxa" w:w="90"/>
+              <w:bottom w:type="dxa" w:w="40"/>
+              <w:right w:type="dxa" w:w="90"/>
+            </w:tcMar>
+          </w:tcPr>
+          <w:p>
+            <w:pPr>
+              <w:spacing w:after="0" w:line="240"/>
+              <w:jc w:val="right"/>
+            </w:pPr>
+            <w:r>
+              <w:rPr>
+                <w:b w:val="false"/>
+                <w:bCs w:val="false"/>
+                <w:sz w:val="17"/>
+                <w:szCs w:val="17"/>
+              </w:rPr>
+              <w:t xml:space="preserve">0,84</w:t>
+            </w:r>
+          </w:p>
+        </w:tc>
+        <w:tc>
+          <w:tcPr>
+            <w:tcW w:type="dxa" w:w="1000"/>
+            <w:tcMar>
+              <w:top w:type="dxa" w:w="40"/>
+              <w:left w:type="dxa" w:w="90"/>
+              <w:bottom w:type="dxa" w:w="40"/>
+              <w:right w:type="dxa" w:w="90"/>
+            </w:tcMar>
+          </w:tcPr>
+          <w:p>
+            <w:pPr>
+              <w:spacing w:after="0" w:line="240"/>
+              <w:jc w:val="right"/>
+            </w:pPr>
+            <w:r>
+              <w:rPr>
+                <w:b w:val="false"/>
+                <w:bCs w:val="false"/>
+                <w:sz w:val="17"/>
+                <w:szCs w:val="17"/>
+              </w:rPr>
+              <w:t xml:space="preserve">0,72</w:t>
+            </w:r>
+          </w:p>
+        </w:tc>
+      </w:tr>
+      <w:tr>
+        <w:tc>
+          <w:tcPr>
+            <w:tcW w:type="dxa" w:w="3160"/>
+            <w:tcMar>
+              <w:top w:type="dxa" w:w="40"/>
+              <w:left w:type="dxa" w:w="90"/>
+              <w:bottom w:type="dxa" w:w="40"/>
+              <w:right w:type="dxa" w:w="90"/>
+            </w:tcMar>
+          </w:tcPr>
+          <w:p>
+            <w:pPr>
+              <w:spacing w:after="0" w:line="240"/>
+              <w:jc w:val="left"/>
+            </w:pPr>
+            <w:r>
+              <w:rPr>
+                <w:b w:val="false"/>
+                <w:bCs w:val="false"/>
+                <w:sz w:val="17"/>
+                <w:szCs w:val="17"/>
+              </w:rPr>
+              <w:t xml:space="preserve">Vigor</w:t>
+            </w:r>
+          </w:p>
+        </w:tc>
+        <w:tc>
+          <w:tcPr>
+            <w:tcW w:type="dxa" w:w="1240"/>
+            <w:tcMar>
+              <w:top w:type="dxa" w:w="40"/>
+              <w:left w:type="dxa" w:w="90"/>
+              <w:bottom w:type="dxa" w:w="40"/>
+              <w:right w:type="dxa" w:w="90"/>
+            </w:tcMar>
+          </w:tcPr>
+          <w:p>
+            <w:pPr>
+              <w:spacing w:after="0" w:line="240"/>
+              <w:jc w:val="right"/>
+            </w:pPr>
+            <w:r>
+              <w:rPr>
+                <w:b w:val="false"/>
+                <w:bCs w:val="false"/>
+                <w:sz w:val="17"/>
+                <w:szCs w:val="17"/>
+              </w:rPr>
+              <w:t xml:space="preserve">0,75</w:t>
+            </w:r>
+          </w:p>
+        </w:tc>
+        <w:tc>
+          <w:tcPr>
+            <w:tcW w:type="dxa" w:w="1960"/>
+            <w:tcMar>
+              <w:top w:type="dxa" w:w="40"/>
+              <w:left w:type="dxa" w:w="90"/>
+              <w:bottom w:type="dxa" w:w="40"/>
+              <w:right w:type="dxa" w:w="90"/>
+            </w:tcMar>
+          </w:tcPr>
+          <w:p>
+            <w:pPr>
+              <w:spacing w:after="0" w:line="240"/>
+              <w:jc w:val="right"/>
+            </w:pPr>
+            <w:r>
+              <w:rPr>
+                <w:b w:val="false"/>
+                <w:bCs w:val="false"/>
+                <w:sz w:val="17"/>
+                <w:szCs w:val="17"/>
+              </w:rPr>
+              <w:t xml:space="preserve">[0,64; 0,85]</w:t>
+            </w:r>
+          </w:p>
+        </w:tc>
+        <w:tc>
+          <w:tcPr>
+            <w:tcW w:type="dxa" w:w="1000"/>
+            <w:tcMar>
+              <w:top w:type="dxa" w:w="40"/>
+              <w:left w:type="dxa" w:w="90"/>
+              <w:bottom w:type="dxa" w:w="40"/>
+              <w:right w:type="dxa" w:w="90"/>
+            </w:tcMar>
+          </w:tcPr>
+          <w:p>
+            <w:pPr>
+              <w:spacing w:after="0" w:line="240"/>
+              <w:jc w:val="right"/>
+            </w:pPr>
+            <w:r>
+              <w:rPr>
+                <w:b w:val="false"/>
+                <w:bCs w:val="false"/>
+                <w:sz w:val="17"/>
+                <w:szCs w:val="17"/>
+              </w:rPr>
+              <w:t xml:space="preserve">0,85</w:t>
+            </w:r>
+          </w:p>
+        </w:tc>
+        <w:tc>
+          <w:tcPr>
+            <w:tcW w:type="dxa" w:w="1000"/>
+            <w:tcMar>
+              <w:top w:type="dxa" w:w="40"/>
+              <w:left w:type="dxa" w:w="90"/>
+              <w:bottom w:type="dxa" w:w="40"/>
+              <w:right w:type="dxa" w:w="90"/>
+            </w:tcMar>
+          </w:tcPr>
+          <w:p>
+            <w:pPr>
+              <w:spacing w:after="0" w:line="240"/>
+              <w:jc w:val="right"/>
+            </w:pPr>
+            <w:r>
+              <w:rPr>
+                <w:b w:val="false"/>
+                <w:bCs w:val="false"/>
+                <w:sz w:val="17"/>
+                <w:szCs w:val="17"/>
+              </w:rPr>
+              <w:t xml:space="preserve">0,56</w:t>
+            </w:r>
+          </w:p>
+        </w:tc>
+        <w:tc>
+          <w:tcPr>
+            <w:tcW w:type="dxa" w:w="1000"/>
+            <w:tcMar>
+              <w:top w:type="dxa" w:w="40"/>
+              <w:left w:type="dxa" w:w="90"/>
+              <w:bottom w:type="dxa" w:w="40"/>
+              <w:right w:type="dxa" w:w="90"/>
+            </w:tcMar>
+          </w:tcPr>
+          <w:p>
+            <w:pPr>
+              <w:spacing w:after="0" w:line="240"/>
+              <w:jc w:val="right"/>
+            </w:pPr>
+            <w:r>
+              <w:rPr>
+                <w:b w:val="false"/>
+                <w:bCs w:val="false"/>
+                <w:sz w:val="17"/>
+                <w:szCs w:val="17"/>
+              </w:rPr>
+              <w:t xml:space="preserve">0,48</w:t>
+            </w:r>
+          </w:p>
+        </w:tc>
+      </w:tr>
+      <w:tr>
+        <w:tc>
+          <w:tcPr>
+            <w:tcW w:type="dxa" w:w="3160"/>
+            <w:tcMar>
+              <w:top w:type="dxa" w:w="40"/>
+              <w:left w:type="dxa" w:w="90"/>
+              <w:bottom w:type="dxa" w:w="40"/>
+              <w:right w:type="dxa" w:w="90"/>
+            </w:tcMar>
+          </w:tcPr>
+          <w:p>
+            <w:pPr>
+              <w:spacing w:after="0" w:line="240"/>
+              <w:jc w:val="left"/>
+            </w:pPr>
+            <w:r>
+              <w:rPr>
+                <w:b w:val="false"/>
+                <w:bCs w:val="false"/>
+                <w:sz w:val="17"/>
+                <w:szCs w:val="17"/>
+              </w:rPr>
+              <w:t xml:space="preserve">Depressão</w:t>
+            </w:r>
+          </w:p>
+        </w:tc>
+        <w:tc>
+          <w:tcPr>
+            <w:tcW w:type="dxa" w:w="1240"/>
+            <w:tcMar>
+              <w:top w:type="dxa" w:w="40"/>
+              <w:left w:type="dxa" w:w="90"/>
+              <w:bottom w:type="dxa" w:w="40"/>
+              <w:right w:type="dxa" w:w="90"/>
+            </w:tcMar>
+          </w:tcPr>
+          <w:p>
+            <w:pPr>
+              <w:spacing w:after="0" w:line="240"/>
+              <w:jc w:val="right"/>
+            </w:pPr>
+            <w:r>
+              <w:rPr>
+                <w:b w:val="false"/>
+                <w:bCs w:val="false"/>
+                <w:sz w:val="17"/>
+                <w:szCs w:val="17"/>
+              </w:rPr>
+              <w:t xml:space="preserve">0,71</w:t>
+            </w:r>
+          </w:p>
+        </w:tc>
+        <w:tc>
+          <w:tcPr>
+            <w:tcW w:type="dxa" w:w="1960"/>
+            <w:tcMar>
+              <w:top w:type="dxa" w:w="40"/>
+              <w:left w:type="dxa" w:w="90"/>
+              <w:bottom w:type="dxa" w:w="40"/>
+              <w:right w:type="dxa" w:w="90"/>
+            </w:tcMar>
+          </w:tcPr>
+          <w:p>
+            <w:pPr>
+              <w:spacing w:after="0" w:line="240"/>
+              <w:jc w:val="right"/>
+            </w:pPr>
+            <w:r>
+              <w:rPr>
+                <w:b w:val="false"/>
+                <w:bCs w:val="false"/>
+                <w:sz w:val="17"/>
+                <w:szCs w:val="17"/>
+              </w:rPr>
+              <w:t xml:space="preserve">[0,59; 0,80]</w:t>
+            </w:r>
+          </w:p>
+        </w:tc>
+        <w:tc>
+          <w:tcPr>
+            <w:tcW w:type="dxa" w:w="1000"/>
+            <w:tcMar>
+              <w:top w:type="dxa" w:w="40"/>
+              <w:left w:type="dxa" w:w="90"/>
+              <w:bottom w:type="dxa" w:w="40"/>
+              <w:right w:type="dxa" w:w="90"/>
+            </w:tcMar>
+          </w:tcPr>
+          <w:p>
+            <w:pPr>
+              <w:spacing w:after="0" w:line="240"/>
+              <w:jc w:val="right"/>
+            </w:pPr>
+            <w:r>
+              <w:rPr>
+                <w:b w:val="false"/>
+                <w:bCs w:val="false"/>
+                <w:sz w:val="17"/>
+                <w:szCs w:val="17"/>
+              </w:rPr>
+              <w:t xml:space="preserve">0,54</w:t>
+            </w:r>
+          </w:p>
+        </w:tc>
+        <w:tc>
+          <w:tcPr>
+            <w:tcW w:type="dxa" w:w="1000"/>
+            <w:tcMar>
+              <w:top w:type="dxa" w:w="40"/>
+              <w:left w:type="dxa" w:w="90"/>
+              <w:bottom w:type="dxa" w:w="40"/>
+              <w:right w:type="dxa" w:w="90"/>
+            </w:tcMar>
+          </w:tcPr>
+          <w:p>
+            <w:pPr>
+              <w:spacing w:after="0" w:line="240"/>
+              <w:jc w:val="right"/>
+            </w:pPr>
+            <w:r>
+              <w:rPr>
+                <w:b w:val="false"/>
+                <w:bCs w:val="false"/>
+                <w:sz w:val="17"/>
+                <w:szCs w:val="17"/>
+              </w:rPr>
+              <w:t xml:space="preserve">0,85</w:t>
+            </w:r>
+          </w:p>
+        </w:tc>
+        <w:tc>
+          <w:tcPr>
+            <w:tcW w:type="dxa" w:w="1000"/>
+            <w:tcMar>
+              <w:top w:type="dxa" w:w="40"/>
+              <w:left w:type="dxa" w:w="90"/>
+              <w:bottom w:type="dxa" w:w="40"/>
+              <w:right w:type="dxa" w:w="90"/>
+            </w:tcMar>
+          </w:tcPr>
+          <w:p>
+            <w:pPr>
+              <w:spacing w:after="0" w:line="240"/>
+              <w:jc w:val="right"/>
+            </w:pPr>
+            <w:r>
+              <w:rPr>
+                <w:b w:val="false"/>
+                <w:bCs w:val="false"/>
+                <w:sz w:val="17"/>
+                <w:szCs w:val="17"/>
+              </w:rPr>
+              <w:t xml:space="preserve">0,79</w:t>
+            </w:r>
+          </w:p>
+        </w:tc>
+      </w:tr>
+      <w:tr>
+        <w:tc>
+          <w:tcPr>
+            <w:tcW w:type="dxa" w:w="3160"/>
+            <w:tcMar>
+              <w:top w:type="dxa" w:w="40"/>
+              <w:left w:type="dxa" w:w="90"/>
+              <w:bottom w:type="dxa" w:w="40"/>
+              <w:right w:type="dxa" w:w="90"/>
+            </w:tcMar>
+          </w:tcPr>
+          <w:p>
+            <w:pPr>
+              <w:spacing w:after="0" w:line="240"/>
+              <w:jc w:val="left"/>
+            </w:pPr>
+            <w:r>
+              <w:rPr>
+                <w:b w:val="false"/>
+                <w:bCs w:val="false"/>
+                <w:sz w:val="17"/>
+                <w:szCs w:val="17"/>
+              </w:rPr>
+              <w:t xml:space="preserve">Raiva</w:t>
+            </w:r>
+          </w:p>
+        </w:tc>
+        <w:tc>
+          <w:tcPr>
+            <w:tcW w:type="dxa" w:w="1240"/>
+            <w:tcMar>
+              <w:top w:type="dxa" w:w="40"/>
+              <w:left w:type="dxa" w:w="90"/>
+              <w:bottom w:type="dxa" w:w="40"/>
+              <w:right w:type="dxa" w:w="90"/>
+            </w:tcMar>
+          </w:tcPr>
+          <w:p>
+            <w:pPr>
+              <w:spacing w:after="0" w:line="240"/>
+              <w:jc w:val="right"/>
+            </w:pPr>
+            <w:r>
+              <w:rPr>
+                <w:b w:val="false"/>
+                <w:bCs w:val="false"/>
+                <w:sz w:val="17"/>
+                <w:szCs w:val="17"/>
+              </w:rPr>
+              <w:t xml:space="preserve">0,67</w:t>
+            </w:r>
+          </w:p>
+        </w:tc>
+        <w:tc>
+          <w:tcPr>
+            <w:tcW w:type="dxa" w:w="1960"/>
+            <w:tcMar>
+              <w:top w:type="dxa" w:w="40"/>
+              <w:left w:type="dxa" w:w="90"/>
+              <w:bottom w:type="dxa" w:w="40"/>
+              <w:right w:type="dxa" w:w="90"/>
+            </w:tcMar>
+          </w:tcPr>
+          <w:p>
+            <w:pPr>
+              <w:spacing w:after="0" w:line="240"/>
+              <w:jc w:val="right"/>
+            </w:pPr>
+            <w:r>
+              <w:rPr>
+                <w:b w:val="false"/>
+                <w:bCs w:val="false"/>
+                <w:sz w:val="17"/>
+                <w:szCs w:val="17"/>
+              </w:rPr>
+              <w:t xml:space="preserve">[0,57; 0,77]</w:t>
+            </w:r>
+          </w:p>
+        </w:tc>
+        <w:tc>
+          <w:tcPr>
+            <w:tcW w:type="dxa" w:w="1000"/>
+            <w:tcMar>
+              <w:top w:type="dxa" w:w="40"/>
+              <w:left w:type="dxa" w:w="90"/>
+              <w:bottom w:type="dxa" w:w="40"/>
+              <w:right w:type="dxa" w:w="90"/>
+            </w:tcMar>
+          </w:tcPr>
+          <w:p>
+            <w:pPr>
+              <w:spacing w:after="0" w:line="240"/>
+              <w:jc w:val="right"/>
+            </w:pPr>
+            <w:r>
+              <w:rPr>
+                <w:b w:val="false"/>
+                <w:bCs w:val="false"/>
+                <w:sz w:val="17"/>
+                <w:szCs w:val="17"/>
+              </w:rPr>
+              <w:t xml:space="preserve">0,55</w:t>
+            </w:r>
+          </w:p>
+        </w:tc>
+        <w:tc>
+          <w:tcPr>
+            <w:tcW w:type="dxa" w:w="1000"/>
+            <w:tcMar>
+              <w:top w:type="dxa" w:w="40"/>
+              <w:left w:type="dxa" w:w="90"/>
+              <w:bottom w:type="dxa" w:w="40"/>
+              <w:right w:type="dxa" w:w="90"/>
+            </w:tcMar>
+          </w:tcPr>
+          <w:p>
+            <w:pPr>
+              <w:spacing w:after="0" w:line="240"/>
+              <w:jc w:val="right"/>
+            </w:pPr>
+            <w:r>
+              <w:rPr>
+                <w:b w:val="false"/>
+                <w:bCs w:val="false"/>
+                <w:sz w:val="17"/>
+                <w:szCs w:val="17"/>
+              </w:rPr>
+              <w:t xml:space="preserve">0,76</w:t>
+            </w:r>
+          </w:p>
+        </w:tc>
+        <w:tc>
+          <w:tcPr>
+            <w:tcW w:type="dxa" w:w="1000"/>
+            <w:tcMar>
+              <w:top w:type="dxa" w:w="40"/>
+              <w:left w:type="dxa" w:w="90"/>
+              <w:bottom w:type="dxa" w:w="40"/>
+              <w:right w:type="dxa" w:w="90"/>
+            </w:tcMar>
+          </w:tcPr>
+          <w:p>
+            <w:pPr>
+              <w:spacing w:after="0" w:line="240"/>
+              <w:jc w:val="right"/>
+            </w:pPr>
+            <w:r>
+              <w:rPr>
+                <w:b w:val="false"/>
+                <w:bCs w:val="false"/>
+                <w:sz w:val="17"/>
+                <w:szCs w:val="17"/>
+              </w:rPr>
+              <w:t xml:space="preserve">0,19</w:t>
+            </w:r>
+          </w:p>
+        </w:tc>
+      </w:tr>
+      <w:tr>
+        <w:tc>
+          <w:tcPr>
+            <w:tcW w:type="dxa" w:w="3160"/>
+            <w:tcMar>
+              <w:top w:type="dxa" w:w="40"/>
+              <w:left w:type="dxa" w:w="90"/>
+              <w:bottom w:type="dxa" w:w="40"/>
+              <w:right w:type="dxa" w:w="90"/>
+            </w:tcMar>
+          </w:tcPr>
+          <w:p>
+            <w:pPr>
+              <w:spacing w:after="0" w:line="240"/>
+              <w:jc w:val="left"/>
+            </w:pPr>
+            <w:r>
+              <w:rPr>
+                <w:b w:val="false"/>
+                <w:bCs w:val="false"/>
+                <w:sz w:val="17"/>
+                <w:szCs w:val="17"/>
+              </w:rPr>
+              <w:t xml:space="preserve">Confusão</w:t>
+            </w:r>
+          </w:p>
+        </w:tc>
+        <w:tc>
+          <w:tcPr>
+            <w:tcW w:type="dxa" w:w="1240"/>
+            <w:tcMar>
+              <w:top w:type="dxa" w:w="40"/>
+              <w:left w:type="dxa" w:w="90"/>
+              <w:bottom w:type="dxa" w:w="40"/>
+              <w:right w:type="dxa" w:w="90"/>
+            </w:tcMar>
+          </w:tcPr>
+          <w:p>
+            <w:pPr>
+              <w:spacing w:after="0" w:line="240"/>
+              <w:jc w:val="right"/>
+            </w:pPr>
+            <w:r>
+              <w:rPr>
+                <w:b w:val="false"/>
+                <w:bCs w:val="false"/>
+                <w:sz w:val="17"/>
+                <w:szCs w:val="17"/>
+              </w:rPr>
+              <w:t xml:space="preserve">0,55</w:t>
+            </w:r>
+          </w:p>
+        </w:tc>
+        <w:tc>
+          <w:tcPr>
+            <w:tcW w:type="dxa" w:w="1960"/>
+            <w:tcMar>
+              <w:top w:type="dxa" w:w="40"/>
+              <w:left w:type="dxa" w:w="90"/>
+              <w:bottom w:type="dxa" w:w="40"/>
+              <w:right w:type="dxa" w:w="90"/>
+            </w:tcMar>
+          </w:tcPr>
+          <w:p>
+            <w:pPr>
+              <w:spacing w:after="0" w:line="240"/>
+              <w:jc w:val="right"/>
+            </w:pPr>
+            <w:r>
+              <w:rPr>
+                <w:b w:val="false"/>
+                <w:bCs w:val="false"/>
+                <w:sz w:val="17"/>
+                <w:szCs w:val="17"/>
+              </w:rPr>
+              <w:t xml:space="preserve">[0,50; 0,66]</w:t>
+            </w:r>
+          </w:p>
+        </w:tc>
+        <w:tc>
+          <w:tcPr>
+            <w:tcW w:type="dxa" w:w="1000"/>
+            <w:tcMar>
+              <w:top w:type="dxa" w:w="40"/>
+              <w:left w:type="dxa" w:w="90"/>
+              <w:bottom w:type="dxa" w:w="40"/>
+              <w:right w:type="dxa" w:w="90"/>
+            </w:tcMar>
+          </w:tcPr>
+          <w:p>
+            <w:pPr>
+              <w:spacing w:after="0" w:line="240"/>
+              <w:jc w:val="right"/>
+            </w:pPr>
+            <w:r>
+              <w:rPr>
+                <w:b w:val="false"/>
+                <w:bCs w:val="false"/>
+                <w:sz w:val="17"/>
+                <w:szCs w:val="17"/>
+              </w:rPr>
+              <w:t xml:space="preserve">0,25</w:t>
+            </w:r>
+          </w:p>
+        </w:tc>
+        <w:tc>
+          <w:tcPr>
+            <w:tcW w:type="dxa" w:w="1000"/>
+            <w:tcMar>
+              <w:top w:type="dxa" w:w="40"/>
+              <w:left w:type="dxa" w:w="90"/>
+              <w:bottom w:type="dxa" w:w="40"/>
+              <w:right w:type="dxa" w:w="90"/>
+            </w:tcMar>
+          </w:tcPr>
+          <w:p>
+            <w:pPr>
+              <w:spacing w:after="0" w:line="240"/>
+              <w:jc w:val="right"/>
+            </w:pPr>
+            <w:r>
+              <w:rPr>
+                <w:b w:val="false"/>
+                <w:bCs w:val="false"/>
+                <w:sz w:val="17"/>
+                <w:szCs w:val="17"/>
+              </w:rPr>
+              <w:t xml:space="preserve">0,84</w:t>
+            </w:r>
+          </w:p>
+        </w:tc>
+        <w:tc>
+          <w:tcPr>
+            <w:tcW w:type="dxa" w:w="1000"/>
+            <w:tcMar>
+              <w:top w:type="dxa" w:w="40"/>
+              <w:left w:type="dxa" w:w="90"/>
+              <w:bottom w:type="dxa" w:w="40"/>
+              <w:right w:type="dxa" w:w="90"/>
+            </w:tcMar>
+          </w:tcPr>
+          <w:p>
+            <w:pPr>
+              <w:spacing w:after="0" w:line="240"/>
+              <w:jc w:val="right"/>
+            </w:pPr>
+            <w:r>
+              <w:rPr>
+                <w:b w:val="false"/>
+                <w:bCs w:val="false"/>
+                <w:sz w:val="17"/>
+                <w:szCs w:val="17"/>
+              </w:rPr>
+              <w:t xml:space="preserve">0,41</w:t>
+            </w:r>
+          </w:p>
+        </w:tc>
+      </w:tr>
+      <w:tr>
+        <w:tc>
+          <w:tcPr>
+            <w:tcW w:type="dxa" w:w="3160"/>
+            <w:tcMar>
+              <w:top w:type="dxa" w:w="40"/>
+              <w:left w:type="dxa" w:w="90"/>
+              <w:bottom w:type="dxa" w:w="40"/>
+              <w:right w:type="dxa" w:w="90"/>
+            </w:tcMar>
+          </w:tcPr>
+          <w:p>
+            <w:pPr>
+              <w:spacing w:after="0" w:line="240"/>
+              <w:jc w:val="left"/>
+            </w:pPr>
+            <w:r>
+              <w:rPr>
+                <w:b w:val="false"/>
+                <w:bCs w:val="false"/>
+                <w:sz w:val="17"/>
+                <w:szCs w:val="17"/>
+              </w:rPr>
+              <w:t xml:space="preserve">Tensão</w:t>
+            </w:r>
+          </w:p>
+        </w:tc>
+        <w:tc>
+          <w:tcPr>
+            <w:tcW w:type="dxa" w:w="1240"/>
+            <w:tcMar>
+              <w:top w:type="dxa" w:w="40"/>
+              <w:left w:type="dxa" w:w="90"/>
+              <w:bottom w:type="dxa" w:w="40"/>
+              <w:right w:type="dxa" w:w="90"/>
+            </w:tcMar>
+          </w:tcPr>
+          <w:p>
+            <w:pPr>
+              <w:spacing w:after="0" w:line="240"/>
+              <w:jc w:val="right"/>
+            </w:pPr>
+            <w:r>
+              <w:rPr>
+                <w:b w:val="false"/>
+                <w:bCs w:val="false"/>
+                <w:sz w:val="17"/>
+                <w:szCs w:val="17"/>
+              </w:rPr>
+              <w:t xml:space="preserve">0,54</w:t>
+            </w:r>
+          </w:p>
+        </w:tc>
+        <w:tc>
+          <w:tcPr>
+            <w:tcW w:type="dxa" w:w="1960"/>
+            <w:tcMar>
+              <w:top w:type="dxa" w:w="40"/>
+              <w:left w:type="dxa" w:w="90"/>
+              <w:bottom w:type="dxa" w:w="40"/>
+              <w:right w:type="dxa" w:w="90"/>
+            </w:tcMar>
+          </w:tcPr>
+          <w:p>
+            <w:pPr>
+              <w:spacing w:after="0" w:line="240"/>
+              <w:jc w:val="right"/>
+            </w:pPr>
+            <w:r>
+              <w:rPr>
+                <w:b w:val="false"/>
+                <w:bCs w:val="false"/>
+                <w:sz w:val="17"/>
+                <w:szCs w:val="17"/>
+              </w:rPr>
+              <w:t xml:space="preserve">[0,50; 0,68]</w:t>
+            </w:r>
+          </w:p>
+        </w:tc>
+        <w:tc>
+          <w:tcPr>
+            <w:tcW w:type="dxa" w:w="1000"/>
+            <w:tcMar>
+              <w:top w:type="dxa" w:w="40"/>
+              <w:left w:type="dxa" w:w="90"/>
+              <w:bottom w:type="dxa" w:w="40"/>
+              <w:right w:type="dxa" w:w="90"/>
+            </w:tcMar>
+          </w:tcPr>
+          <w:p>
+            <w:pPr>
+              <w:spacing w:after="0" w:line="240"/>
+              <w:jc w:val="right"/>
+            </w:pPr>
+            <w:r>
+              <w:rPr>
+                <w:b w:val="false"/>
+                <w:bCs w:val="false"/>
+                <w:sz w:val="17"/>
+                <w:szCs w:val="17"/>
+              </w:rPr>
+              <w:t xml:space="preserve">0,52</w:t>
+            </w:r>
+          </w:p>
+        </w:tc>
+        <w:tc>
+          <w:tcPr>
+            <w:tcW w:type="dxa" w:w="1000"/>
+            <w:tcMar>
+              <w:top w:type="dxa" w:w="40"/>
+              <w:left w:type="dxa" w:w="90"/>
+              <w:bottom w:type="dxa" w:w="40"/>
+              <w:right w:type="dxa" w:w="90"/>
+            </w:tcMar>
+          </w:tcPr>
+          <w:p>
+            <w:pPr>
+              <w:spacing w:after="0" w:line="240"/>
+              <w:jc w:val="right"/>
+            </w:pPr>
+            <w:r>
+              <w:rPr>
+                <w:b w:val="false"/>
+                <w:bCs w:val="false"/>
+                <w:sz w:val="17"/>
+                <w:szCs w:val="17"/>
+              </w:rPr>
+              <w:t xml:space="preserve">0,57</w:t>
+            </w:r>
+          </w:p>
+        </w:tc>
+        <w:tc>
+          <w:tcPr>
+            <w:tcW w:type="dxa" w:w="1000"/>
+            <w:tcMar>
+              <w:top w:type="dxa" w:w="40"/>
+              <w:left w:type="dxa" w:w="90"/>
+              <w:bottom w:type="dxa" w:w="40"/>
+              <w:right w:type="dxa" w:w="90"/>
+            </w:tcMar>
+          </w:tcPr>
+          <w:p>
+            <w:pPr>
+              <w:spacing w:after="0" w:line="240"/>
+              <w:jc w:val="right"/>
+            </w:pPr>
+            <w:r>
+              <w:rPr>
+                <w:b w:val="false"/>
+                <w:bCs w:val="false"/>
+                <w:sz w:val="17"/>
+                <w:szCs w:val="17"/>
+              </w:rPr>
+              <w:t xml:space="preserve">0,83</w:t>
+            </w:r>
+          </w:p>
+        </w:tc>
+      </w:tr>
+    </w:tbl>
+    <w:p>
+      <w:pPr>
+        <w:spacing w:after="180" w:before="60"/>
+      </w:pPr>
+      <w:r>
+        <w:rPr>
+          <w:i/>
+          <w:iCs/>
+          <w:color w:val="5B6B82"/>
+          <w:sz w:val="17"/>
+          <w:szCs w:val="17"/>
+        </w:rPr>
+        <w:t xml:space="preserve">Tabela 11. Preditores de estado de fadiga alta vs. baixa: sensibilidade (AUC, Youden) e confiabilidade (ICC 2,1). A fadiga física lidera a sensibilidade; fadiga mental e depressão reúnem sensibilidade e estabilidade.</w:t>
+      </w:r>
+    </w:p>
+    <w:p>
+      <w:pPr>
+        <w:spacing w:after="40" w:before="120"/>
+        <w:jc w:val="center"/>
+      </w:pPr>
+      <w:r>
+        <w:drawing>
+          <wp:inline distT="0" distB="0" distL="0" distR="0">
+            <wp:extent cx="6286500" cy="2800350"/>
+            <wp:effectExtent t="0" r="0" b="0" l="0"/>
+            <wp:docPr id="1" name="" descr="" title=""/>
+            <wp:cNvGraphicFramePr>
+              <a:graphicFrameLocks xmlns:a="http://schemas.openxmlformats.org/drawingml/2006/main" noChangeAspect="1"/>
+            </wp:cNvGraphicFramePr>
+            <a:graphic xmlns:a="http://schemas.openxmlformats.org/drawingml/2006/main">
+              <a:graphicData uri="http://schemas.openxmlformats.org/drawingml/2006/picture">
+                <pic:pic xmlns:pic="http://schemas.openxmlformats.org/drawingml/2006/picture">
+                  <pic:nvPicPr>
+                    <pic:cNvPr id="0" name="" descr=""/>
+                    <pic:cNvPicPr>
+                      <a:picLocks noChangeAspect="1" noChangeArrowheads="1"/>
+                    </pic:cNvPicPr>
+                  </pic:nvPicPr>
+                  <pic:blipFill>
+                    <a:blip r:embed="rId8" cstate="none"/>
+                    <a:srcRect/>
+                    <a:stretch>
+                      <a:fillRect/>
+                    </a:stretch>
+                  </pic:blipFill>
+                  <pic:spPr bwMode="auto">
+                    <a:xfrm>
+                      <a:off x="0" y="0"/>
+                      <a:ext cx="6286500" cy="2800350"/>
+                    </a:xfrm>
+                    <a:prstGeom prst="rect">
+                      <a:avLst/>
+                    </a:prstGeom>
+                  </pic:spPr>
+                </pic:pic>
+              </a:graphicData>
+            </a:graphic>
+          </wp:inline>
+        </w:drawing>
+      </w:r>
+    </w:p>
+    <w:p>
+      <w:pPr>
+        <w:spacing w:after="180" w:before="60"/>
+      </w:pPr>
+      <w:r>
+        <w:rPr>
+          <w:i/>
+          <w:iCs/>
+          <w:color w:val="5B6B82"/>
+          <w:sz w:val="17"/>
+          <w:szCs w:val="17"/>
+        </w:rPr>
+        <w:t xml:space="preserve">Figura 2. Carga interna × perfil de humor (acoplamento tônico e agudo, com FDR) e preditores de estado de fadiga no plano sensibilidade (AUC) × confiabilidade (ICC 2,1).</w:t>
+      </w:r>
+    </w:p>
+    <w:p>
+      <w:pPr>
+        <w:pStyle w:val="Heading2"/>
+        <w:spacing w:after="120" w:before="260"/>
+      </w:pPr>
+      <w:r>
+        <w:t xml:space="preserve">3.14. Discussão integrada: dos objetivos aos achados</w:t>
+      </w:r>
+    </w:p>
+    <w:p>
+      <w:pPr>
+        <w:spacing w:after="140" w:before="0" w:line="276"/>
+        <w:jc w:val="both"/>
+      </w:pPr>
+      <w:r>
+        <w:rPr>
+          <w:b/>
+          <w:bCs/>
+        </w:rPr>
+        <w:t xml:space="preserve">Interpretação estatística. </w:t>
+      </w:r>
+      <w:r>
+        <w:t xml:space="preserve">A inferência apoia-se em modelos mistos com o atleta como efeito aleatório, que separam variância de traço, dia e estado — condição para falar de resposta ao treino sem pseudorreplicação. Sobre essa base, controle de multiplicidade por FDR, tamanhos de efeito intra-sujeito (dz) e bootstrap agrupado por atleta dão robustez; e a convergência entre famílias que raramente erram juntas (t e Wilcoxon/Friedman, frequentista e bayesiana, univariada e multivariada) indica que o achado é do fenômeno, não do método.</w:t>
+      </w:r>
+    </w:p>
+    <w:p>
+      <w:pPr>
+        <w:spacing w:after="140" w:before="0" w:line="276"/>
+        <w:jc w:val="both"/>
+      </w:pPr>
+      <w:r>
+        <w:rPr>
+          <w:b/>
+          <w:bCs/>
+        </w:rPr>
+        <w:t xml:space="preserve">Interpretação fisiológica. </w:t>
+      </w:r>
+      <w:r>
+        <w:t xml:space="preserve">As sessões foram quase-máximas (FC de pico 181–184 bpm; %HRR 0,87–0,91; PSE final 9,3–9,6). O custo alto e homogêneo traduz-se em fadiga física (dz ≈ 1,0), que acumula e é a única dimensão amplificada pelo HIIT no agudo. O desacoplamento carga↔humor mostra que, num regime de teto, a variação relevante do humor depende de fatores individuais de tolerância e recuperação, não do custo cardiovascular da sessão.</w:t>
+      </w:r>
+    </w:p>
+    <w:p>
+      <w:pPr>
+        <w:spacing w:after="140" w:before="0" w:line="276"/>
+        <w:jc w:val="both"/>
+      </w:pPr>
+      <w:r>
+        <w:rPr>
+          <w:b/>
+          <w:bCs/>
+        </w:rPr>
+        <w:t xml:space="preserve">Interpretação psicológica. </w:t>
+      </w:r>
+      <w:r>
+        <w:t xml:space="preserve">A mudança pré→pós é um deslocamento de estado sobre o eixo energia–fadiga (vigor achata, fadiga sobe; negativas quase paradas) — erosão do perfil "iceberg". A invariância de medida (métrica sustentada; escalar aproximada; estrita no limite, com a quebra localizada no item "Sonolento") confirma que o HIIT muda o estado medido, não o significado do instrumento; o deslocamento latente recai sobre fadiga (+0,56) e vigor (−0,26). O padrão é coerente com a resposta afetiva a exercício intervalado intenso (Marques et al., 2020; Patten et al., 2022).</w:t>
+      </w:r>
+    </w:p>
+    <w:p>
+      <w:pPr>
+        <w:spacing w:after="140" w:before="0" w:line="276"/>
+        <w:jc w:val="both"/>
+      </w:pPr>
+      <w:r>
+        <w:rPr>
+          <w:b/>
+          <w:bCs/>
+        </w:rPr>
+        <w:t xml:space="preserve">Pontos fortes, validade e impactos. </w:t>
+      </w:r>
+      <w:r>
+        <w:t xml:space="preserve">Disciplina de atleta-como-unidade, triangulação por métodos independentes, caracterização psicométrica completa (confiabilidade, AFC, AFE, TRI, invariância configural→estrita/parcial) e reprodutibilidade por código. Validade convergente (BRUMS ↔ autorrelatos externos), de construto (invariância) e diagnóstica (AUC). Impacto aplicado: um protocolo de monitoramento parcimonioso — fadiga física (sensível) e fadiga mental/depressão (estáveis) — para individualizar carga e recuperação; com a ressalva honesta de que a FC/TRIMP não substituem o autorrelato e de que decisões pela média do grupo podem prejudicar subgrupos.</w:t>
+      </w:r>
+    </w:p>
+    <w:p>
+      <w:r>
+        <w:br w:type="page"/>
+      </w:r>
+    </w:p>
+    <w:p>
+      <w:pPr>
         <w:pStyle w:val="Heading1"/>
         <w:spacing w:after="120" w:before="260"/>
       </w:pPr>
@@ -11739,7 +13220,23 @@
         <w:t xml:space="preserve">Limitações. </w:t>
       </w:r>
       <w:r>
-        <w:t xml:space="preserve">Desenho observacional; possível confundimento entre volume e intensidade nos dias de HIIT; carga interna por FC sem duração registrada (TRIMP relativo por sessão); amostra de um único clube. A contribuição metodológica central — respeitar a estrutura de medidas repetidas — protege as conclusões contra a pseudorreplicação.</w:t>
+        <w:t xml:space="preserve">Desenho observacional; possível confundimento entre volume e intensidade nos dias de HIIT; carga interna por FC sem duração registrada (TRIMP relativo por sessão); efeito de teto na carga que comprime a variância explicativa; itens com efeito piso (tensão, confusão); sonolência medida por um único item; amostra de um único clube. A contribuição metodológica central — respeitar a estrutura de medidas repetidas — protege as conclusões contra a pseudorreplicação.</w:t>
+      </w:r>
+    </w:p>
+    <w:p>
+      <w:pPr>
+        <w:spacing w:after="140" w:before="0" w:line="276"/>
+        <w:jc w:val="both"/>
+      </w:pPr>
+      <w:r>
+        <w:rPr>
+          <w:b/>
+          <w:bCs/>
+        </w:rPr>
+        <w:t xml:space="preserve">Direções futuras. </w:t>
+      </w:r>
+      <w:r>
+        <w:t xml:space="preserve">(1) desenhos com manipulação da carga (dias pareados de alta vs. baixa intensidade) para testar causalidade; (2) séries temporais mais densas por atleta, viabilizando modelos dinâmicos individuais e o mapeamento de não-respondedores; (3) escala de sono/alerta dedicada, dado que o eixo sono↔alerta se mostrou ortogonal à fadiga; (4) marcadores objetivos de recuperação (VFC, sono) para testar se explicam a variância individual que a carga não captura; (5) validação prospectiva do protocolo parcimonioso (fadiga física + fadiga mental/depressão) contra desfechos de desempenho e lesão.</w:t>
       </w:r>
     </w:p>
     <w:p>
@@ -12052,6 +13549,19 @@
           <w:sz w:val="19"/>
           <w:szCs w:val="19"/>
         </w:rPr>
+        <w:t xml:space="preserve">HADDAD, M. et al. Session-RPE method for training load monitoring: validity, ecological usefulness, and influencing factors. Frontiers in Neuroscience, v. 11, p. 612, 2017. DOI: https://doi.org/10.3389/fnins.2017.00612.</w:t>
+      </w:r>
+    </w:p>
+    <w:p>
+      <w:pPr>
+        <w:spacing w:after="100" w:line="260"/>
+        <w:jc w:val="both"/>
+      </w:pPr>
+      <w:r>
+        <w:rPr>
+          <w:sz w:val="19"/>
+          <w:szCs w:val="19"/>
+        </w:rPr>
         <w:t xml:space="preserve">HALSON, S. L.; JEUKENDRUP, A. E. Does overtraining exist? Sports Medicine, v. 34, n. 14, p. 967-981, 2004.</w:t>
       </w:r>
     </w:p>
@@ -12273,6 +13783,19 @@
           <w:sz w:val="19"/>
           <w:szCs w:val="19"/>
         </w:rPr>
+        <w:t xml:space="preserve">MARQUES, M. et al. Positive affective and enjoyment responses to four high-intensity interval exercise protocols. Perceptual and Motor Skills, v. 127, n. 4, p. 742-765, 2020. DOI: https://doi.org/10.1177/0031512520918748.</w:t>
+      </w:r>
+    </w:p>
+    <w:p>
+      <w:pPr>
+        <w:spacing w:after="100" w:line="260"/>
+        <w:jc w:val="both"/>
+      </w:pPr>
+      <w:r>
+        <w:rPr>
+          <w:sz w:val="19"/>
+          <w:szCs w:val="19"/>
+        </w:rPr>
         <w:t xml:space="preserve">MARTÍNEZ-DÍAZ, I. C. et al. Neurophysiological stress response and mood changes induced by high-intensity interval training: a pilot study. International Journal of Environmental Research and Public Health, v. 18, 2021.</w:t>
       </w:r>
     </w:p>
@@ -12377,6 +13900,19 @@
           <w:sz w:val="19"/>
           <w:szCs w:val="19"/>
         </w:rPr>
+        <w:t xml:space="preserve">PATTEN, R. K. et al. Longitudinal affective response to high-intensity interval training and moderate-intensity continuous training in overweight women with polycystic ovary syndrome: a randomised trial. Psychology of Sport and Exercise, v. 64, p. 102325, 2022. DOI: https://doi.org/10.1016/j.psychsport.2022.102325.</w:t>
+      </w:r>
+    </w:p>
+    <w:p>
+      <w:pPr>
+        <w:spacing w:after="100" w:line="260"/>
+        <w:jc w:val="both"/>
+      </w:pPr>
+      <w:r>
+        <w:rPr>
+          <w:sz w:val="19"/>
+          <w:szCs w:val="19"/>
+        </w:rPr>
         <w:t xml:space="preserve">PUTNICK, D. L.; BORNSTEIN, M. H. Measurement invariance conventions and reporting: The state of the art and future directions for psychological research. Developmental Review, v. 41, p. 71-90, 2016. DOI: https://doi.org/10.1016/j.dr.2016.06.004.</w:t>
       </w:r>
     </w:p>
@@ -12482,6 +14018,19 @@
           <w:szCs w:val="19"/>
         </w:rPr>
         <w:t xml:space="preserve">SAW, A. E.; MAIN, L. C.; GASTIN, P. B. Monitoring the athlete training response: subjective self-reported measures trump commonly used objective measures. British Journal of Sports Medicine, v. 50, n. 5, p. 281-291, 2016.</w:t>
+      </w:r>
+    </w:p>
+    <w:p>
+      <w:pPr>
+        <w:spacing w:after="100" w:line="260"/>
+        <w:jc w:val="both"/>
+      </w:pPr>
+      <w:r>
+        <w:rPr>
+          <w:sz w:val="19"/>
+          <w:szCs w:val="19"/>
+        </w:rPr>
+        <w:t xml:space="preserve">SAW, A. E.; MAIN, L. C.; GASTIN, P. B. Monitoring the athlete training response: subjective self-reported measures trump commonly used objective measures: a systematic review. British Journal of Sports Medicine, v. 50, n. 5, p. 281-291, 2016. DOI: https://doi.org/10.1136/bjsports-2015-094758.</w:t>
       </w:r>
     </w:p>
     <w:p>

</xml_diff>